<commit_message>
Document approximate Parquet size across project
</commit_message>
<xml_diff>
--- a/Procesos_revisado.docx
+++ b/Procesos_revisado.docx
@@ -64,7 +64,7 @@
           <w:szCs w:val="24"/>
           <w:rtl w:val="0"/>
         </w:rPr>
-        <w:t>Este informe presenta el proceso que desarrollamos para analizar y priorizar vuelos con riesgo de llegar con 15 minutos o más de retraso. Trabajamos con el conjunto Flight Delay Dataset 2018–2022, publicado en Kaggle y atribuido al Bureau of Transportation Statistics (BTS): 29.193.782 registros, 61 variables y un archivo combinado de aproximadamente 10,21 GB. Conservamos el procesamiento por bloques y transformamos los datos a Parquet para facilitar las consultas sin cargar el CSV completo en memoria.</w:t>
+        <w:t>Este informe presenta el proceso que desarrollamos para analizar y priorizar vuelos con riesgo de llegar con 15 minutos o más de retraso. Trabajamos con el conjunto Flight Delay Dataset 2018–2022, publicado en Kaggle y atribuido al Bureau of Transportation Statistics (BTS): 29.193.782 registros, 61 variables y un archivo combinado de aproximadamente 10,21 GB. Conservamos el procesamiento por bloques y transformamos los datos a Parquet para facilitar las consultas sin cargar el CSV completo en memoria. El EDA previo registró aproximadamente 0,8 GB para el Parquet combinado, cerca de un 92 % menos que el CSV; esta cifra redondeada no se revalidó en la copia actual.</w:t>
       </w:r>
     </w:p>
     <w:p>
@@ -512,7 +512,7 @@
           <w:szCs w:val="24"/>
           <w:rtl w:val="0"/>
         </w:rPr>
-        <w:t>Transformamos el archivo CSV a Parquet mediante lectura por bloques, para reducir el costo de almacenamiento y permitir consultas por columnas.</w:t>
+        <w:t>Transformamos el archivo CSV a Parquet mediante lectura por bloques, para reducir el costo de almacenamiento y permitir consultas por columnas. El EDA previo registró aproximadamente 0,8 GB para el Parquet combinado, frente a 10,21 GB del CSV (reducción estimada del 92 %). La cifra está redondeada y no se verificó contra el archivo completo porque no está disponible en esta copia. No corresponde a la suma de los 55 Parquet mensuales preparados para modelado, cuyo peso total debe medirse por separado.</w:t>
       </w:r>
     </w:p>
     <w:p>

</xml_diff>